<commit_message>
Fix Without You release-status contradiction in second epilogue
ch56_epilogue2_final.docx ("Notes from Nova") tagged two "Without You"
fragments as unreleased, contradicting the first epilogue's established
fact that the song has been out since February. Fixed both tags in the
source docx, rebuilt the compiled manuscript and extracted text, and
logged the fix in the continuity log along with the two legitimate
"unreleased" epigraphs at Ch. 11 and Ch. 16 that predate the song's
existence in-story. Also cleaned up a stale duplicate ⚠️ flag that had
already been resolved elsewhere in the log.
</commit_message>
<xml_diff>
--- a/When The Applause Fades/_draft-manuscript/ch56_epilogue2_final.docx
+++ b/When The Applause Fades/_draft-manuscript/ch56_epilogue2_final.docx
@@ -501,7 +501,7 @@
           <w:i/>
           <w:iCs/>
         </w:rPr>
-        <w:t>— Nova Hart, “Without You,” unreleased</w:t>
+        <w:t>— Nova Hart, “Without You,” released</w:t>
       </w:r>
     </w:p>
     <w:p w14:paraId="EF00030">
@@ -821,7 +821,7 @@
           <w:i/>
           <w:iCs/>
         </w:rPr>
-        <w:t>— Nova Hart, “Without You,” unreleased</w:t>
+        <w:t>— Nova Hart, “Without You,” released</w:t>
       </w:r>
     </w:p>
     <w:p w14:paraId="EF00050">

</xml_diff>